<commit_message>
docs: add in-depth questions and concepts for Prometheus and Grafana
</commit_message>
<xml_diff>
--- a/TAI_LIEU_VAN_DAP_DO_AN.docx
+++ b/TAI_LIEU_VAN_DAP_DO_AN.docx
@@ -53,8 +53,8 @@
         <w:tblLook w:firstColumn="1" w:firstRow="1" w:lastColumn="0" w:lastRow="0" w:noHBand="0" w:noVBand="1" w:val="04A0"/>
       </w:tblPr>
       <w:tblGrid>
-        <w:gridCol w:w="4824"/>
-        <w:gridCol w:w="4824"/>
+        <w:gridCol w:w="4896"/>
+        <w:gridCol w:w="4896"/>
       </w:tblGrid>
       <w:tr>
         <w:tc>
@@ -304,7 +304,7 @@
       <w:tr>
         <w:tc>
           <w:tcPr>
-            <w:tcW w:type="dxa" w:w="2412"/>
+            <w:tcW w:type="dxa" w:w="2448"/>
             <w:shd w:fill="0E7490"/>
             <w:tcMar>
               <w:top w:w="80" w:type="dxa"/>
@@ -330,7 +330,7 @@
         </w:tc>
         <w:tc>
           <w:tcPr>
-            <w:tcW w:type="dxa" w:w="2412"/>
+            <w:tcW w:type="dxa" w:w="2448"/>
             <w:shd w:fill="0E7490"/>
             <w:tcMar>
               <w:top w:w="80" w:type="dxa"/>
@@ -356,7 +356,7 @@
         </w:tc>
         <w:tc>
           <w:tcPr>
-            <w:tcW w:type="dxa" w:w="2412"/>
+            <w:tcW w:type="dxa" w:w="2448"/>
             <w:shd w:fill="0E7490"/>
             <w:tcMar>
               <w:top w:w="80" w:type="dxa"/>
@@ -382,7 +382,7 @@
         </w:tc>
         <w:tc>
           <w:tcPr>
-            <w:tcW w:type="dxa" w:w="2412"/>
+            <w:tcW w:type="dxa" w:w="2448"/>
             <w:shd w:fill="0E7490"/>
             <w:tcMar>
               <w:top w:w="80" w:type="dxa"/>
@@ -410,7 +410,7 @@
       <w:tr>
         <w:tc>
           <w:tcPr>
-            <w:tcW w:type="dxa" w:w="2412"/>
+            <w:tcW w:type="dxa" w:w="2448"/>
             <w:shd w:fill="FFFFFF"/>
             <w:tcMar>
               <w:top w:w="60" w:type="dxa"/>
@@ -434,7 +434,7 @@
         </w:tc>
         <w:tc>
           <w:tcPr>
-            <w:tcW w:type="dxa" w:w="2412"/>
+            <w:tcW w:type="dxa" w:w="2448"/>
             <w:shd w:fill="FFFFFF"/>
             <w:tcMar>
               <w:top w:w="60" w:type="dxa"/>
@@ -460,7 +460,7 @@
         </w:tc>
         <w:tc>
           <w:tcPr>
-            <w:tcW w:type="dxa" w:w="2412"/>
+            <w:tcW w:type="dxa" w:w="2448"/>
             <w:shd w:fill="FFFFFF"/>
             <w:tcMar>
               <w:top w:w="60" w:type="dxa"/>
@@ -484,7 +484,7 @@
         </w:tc>
         <w:tc>
           <w:tcPr>
-            <w:tcW w:type="dxa" w:w="2412"/>
+            <w:tcW w:type="dxa" w:w="2448"/>
             <w:shd w:fill="FFFFFF"/>
             <w:tcMar>
               <w:top w:w="60" w:type="dxa"/>
@@ -510,7 +510,7 @@
       <w:tr>
         <w:tc>
           <w:tcPr>
-            <w:tcW w:type="dxa" w:w="2412"/>
+            <w:tcW w:type="dxa" w:w="2448"/>
             <w:shd w:fill="F8FAFC"/>
             <w:tcMar>
               <w:top w:w="60" w:type="dxa"/>
@@ -534,7 +534,7 @@
         </w:tc>
         <w:tc>
           <w:tcPr>
-            <w:tcW w:type="dxa" w:w="2412"/>
+            <w:tcW w:type="dxa" w:w="2448"/>
             <w:shd w:fill="F8FAFC"/>
             <w:tcMar>
               <w:top w:w="60" w:type="dxa"/>
@@ -560,7 +560,7 @@
         </w:tc>
         <w:tc>
           <w:tcPr>
-            <w:tcW w:type="dxa" w:w="2412"/>
+            <w:tcW w:type="dxa" w:w="2448"/>
             <w:shd w:fill="F8FAFC"/>
             <w:tcMar>
               <w:top w:w="60" w:type="dxa"/>
@@ -584,7 +584,7 @@
         </w:tc>
         <w:tc>
           <w:tcPr>
-            <w:tcW w:type="dxa" w:w="2412"/>
+            <w:tcW w:type="dxa" w:w="2448"/>
             <w:shd w:fill="F8FAFC"/>
             <w:tcMar>
               <w:top w:w="60" w:type="dxa"/>
@@ -610,7 +610,7 @@
       <w:tr>
         <w:tc>
           <w:tcPr>
-            <w:tcW w:type="dxa" w:w="2412"/>
+            <w:tcW w:type="dxa" w:w="2448"/>
             <w:shd w:fill="FFFFFF"/>
             <w:tcMar>
               <w:top w:w="60" w:type="dxa"/>
@@ -634,7 +634,7 @@
         </w:tc>
         <w:tc>
           <w:tcPr>
-            <w:tcW w:type="dxa" w:w="2412"/>
+            <w:tcW w:type="dxa" w:w="2448"/>
             <w:shd w:fill="FFFFFF"/>
             <w:tcMar>
               <w:top w:w="60" w:type="dxa"/>
@@ -660,7 +660,7 @@
         </w:tc>
         <w:tc>
           <w:tcPr>
-            <w:tcW w:type="dxa" w:w="2412"/>
+            <w:tcW w:type="dxa" w:w="2448"/>
             <w:shd w:fill="FFFFFF"/>
             <w:tcMar>
               <w:top w:w="60" w:type="dxa"/>
@@ -684,7 +684,7 @@
         </w:tc>
         <w:tc>
           <w:tcPr>
-            <w:tcW w:type="dxa" w:w="2412"/>
+            <w:tcW w:type="dxa" w:w="2448"/>
             <w:shd w:fill="FFFFFF"/>
             <w:tcMar>
               <w:top w:w="60" w:type="dxa"/>
@@ -710,7 +710,7 @@
       <w:tr>
         <w:tc>
           <w:tcPr>
-            <w:tcW w:type="dxa" w:w="2412"/>
+            <w:tcW w:type="dxa" w:w="2448"/>
             <w:shd w:fill="F8FAFC"/>
             <w:tcMar>
               <w:top w:w="60" w:type="dxa"/>
@@ -734,7 +734,7 @@
         </w:tc>
         <w:tc>
           <w:tcPr>
-            <w:tcW w:type="dxa" w:w="2412"/>
+            <w:tcW w:type="dxa" w:w="2448"/>
             <w:shd w:fill="F8FAFC"/>
             <w:tcMar>
               <w:top w:w="60" w:type="dxa"/>
@@ -760,7 +760,7 @@
         </w:tc>
         <w:tc>
           <w:tcPr>
-            <w:tcW w:type="dxa" w:w="2412"/>
+            <w:tcW w:type="dxa" w:w="2448"/>
             <w:shd w:fill="F8FAFC"/>
             <w:tcMar>
               <w:top w:w="60" w:type="dxa"/>
@@ -784,7 +784,7 @@
         </w:tc>
         <w:tc>
           <w:tcPr>
-            <w:tcW w:type="dxa" w:w="2412"/>
+            <w:tcW w:type="dxa" w:w="2448"/>
             <w:shd w:fill="F8FAFC"/>
             <w:tcMar>
               <w:top w:w="60" w:type="dxa"/>
@@ -810,7 +810,7 @@
       <w:tr>
         <w:tc>
           <w:tcPr>
-            <w:tcW w:type="dxa" w:w="2412"/>
+            <w:tcW w:type="dxa" w:w="2448"/>
             <w:shd w:fill="FFFFFF"/>
             <w:tcMar>
               <w:top w:w="60" w:type="dxa"/>
@@ -834,7 +834,7 @@
         </w:tc>
         <w:tc>
           <w:tcPr>
-            <w:tcW w:type="dxa" w:w="2412"/>
+            <w:tcW w:type="dxa" w:w="2448"/>
             <w:shd w:fill="FFFFFF"/>
             <w:tcMar>
               <w:top w:w="60" w:type="dxa"/>
@@ -860,7 +860,7 @@
         </w:tc>
         <w:tc>
           <w:tcPr>
-            <w:tcW w:type="dxa" w:w="2412"/>
+            <w:tcW w:type="dxa" w:w="2448"/>
             <w:shd w:fill="FFFFFF"/>
             <w:tcMar>
               <w:top w:w="60" w:type="dxa"/>
@@ -884,7 +884,7 @@
         </w:tc>
         <w:tc>
           <w:tcPr>
-            <w:tcW w:type="dxa" w:w="2412"/>
+            <w:tcW w:type="dxa" w:w="2448"/>
             <w:shd w:fill="FFFFFF"/>
             <w:tcMar>
               <w:top w:w="60" w:type="dxa"/>
@@ -910,7 +910,7 @@
       <w:tr>
         <w:tc>
           <w:tcPr>
-            <w:tcW w:type="dxa" w:w="2412"/>
+            <w:tcW w:type="dxa" w:w="2448"/>
             <w:shd w:fill="F8FAFC"/>
             <w:tcMar>
               <w:top w:w="60" w:type="dxa"/>
@@ -934,7 +934,7 @@
         </w:tc>
         <w:tc>
           <w:tcPr>
-            <w:tcW w:type="dxa" w:w="2412"/>
+            <w:tcW w:type="dxa" w:w="2448"/>
             <w:shd w:fill="F8FAFC"/>
             <w:tcMar>
               <w:top w:w="60" w:type="dxa"/>
@@ -960,7 +960,7 @@
         </w:tc>
         <w:tc>
           <w:tcPr>
-            <w:tcW w:type="dxa" w:w="2412"/>
+            <w:tcW w:type="dxa" w:w="2448"/>
             <w:shd w:fill="F8FAFC"/>
             <w:tcMar>
               <w:top w:w="60" w:type="dxa"/>
@@ -984,7 +984,7 @@
         </w:tc>
         <w:tc>
           <w:tcPr>
-            <w:tcW w:type="dxa" w:w="2412"/>
+            <w:tcW w:type="dxa" w:w="2448"/>
             <w:shd w:fill="F8FAFC"/>
             <w:tcMar>
               <w:top w:w="60" w:type="dxa"/>
@@ -1010,7 +1010,7 @@
       <w:tr>
         <w:tc>
           <w:tcPr>
-            <w:tcW w:type="dxa" w:w="2412"/>
+            <w:tcW w:type="dxa" w:w="2448"/>
             <w:shd w:fill="FFFFFF"/>
             <w:tcMar>
               <w:top w:w="60" w:type="dxa"/>
@@ -1034,7 +1034,7 @@
         </w:tc>
         <w:tc>
           <w:tcPr>
-            <w:tcW w:type="dxa" w:w="2412"/>
+            <w:tcW w:type="dxa" w:w="2448"/>
             <w:shd w:fill="FFFFFF"/>
             <w:tcMar>
               <w:top w:w="60" w:type="dxa"/>
@@ -1060,7 +1060,7 @@
         </w:tc>
         <w:tc>
           <w:tcPr>
-            <w:tcW w:type="dxa" w:w="2412"/>
+            <w:tcW w:type="dxa" w:w="2448"/>
             <w:shd w:fill="FFFFFF"/>
             <w:tcMar>
               <w:top w:w="60" w:type="dxa"/>
@@ -1084,7 +1084,7 @@
         </w:tc>
         <w:tc>
           <w:tcPr>
-            <w:tcW w:type="dxa" w:w="2412"/>
+            <w:tcW w:type="dxa" w:w="2448"/>
             <w:shd w:fill="FFFFFF"/>
             <w:tcMar>
               <w:top w:w="60" w:type="dxa"/>
@@ -1260,7 +1260,7 @@
           <w:color w:val="0E7490"/>
           <w:sz w:val="28"/>
         </w:rPr>
-        <w:t>❓ PHẦN 3: BỘ 25 CÂU HỎI VẤN ĐÁP CHUYÊN SÂU &amp; CÂU TRẢ LỜI MẪU</w:t>
+        <w:t>❓ PHẦN 3: BỘ 27 CÂU HỎI VẤN ĐÁP CHUYÊN SÂU &amp; CÂU TRẢ LỜI MẪU</w:t>
       </w:r>
     </w:p>
     <w:p>
@@ -1321,7 +1321,7 @@
         <w:tblLook w:firstColumn="1" w:firstRow="1" w:lastColumn="0" w:lastRow="0" w:noHBand="0" w:noVBand="1" w:val="04A0"/>
       </w:tblPr>
       <w:tblGrid>
-        <w:gridCol w:w="9648"/>
+        <w:gridCol w:w="9792"/>
       </w:tblGrid>
       <w:tr>
         <w:tc>
@@ -1410,7 +1410,7 @@
         <w:tblLook w:firstColumn="1" w:firstRow="1" w:lastColumn="0" w:lastRow="0" w:noHBand="0" w:noVBand="1" w:val="04A0"/>
       </w:tblPr>
       <w:tblGrid>
-        <w:gridCol w:w="9648"/>
+        <w:gridCol w:w="9792"/>
       </w:tblGrid>
       <w:tr>
         <w:tc>
@@ -1521,7 +1521,7 @@
         <w:tblLook w:firstColumn="1" w:firstRow="1" w:lastColumn="0" w:lastRow="0" w:noHBand="0" w:noVBand="1" w:val="04A0"/>
       </w:tblPr>
       <w:tblGrid>
-        <w:gridCol w:w="9648"/>
+        <w:gridCol w:w="9792"/>
       </w:tblGrid>
       <w:tr>
         <w:tc>
@@ -1614,7 +1614,7 @@
         <w:tblLook w:firstColumn="1" w:firstRow="1" w:lastColumn="0" w:lastRow="0" w:noHBand="0" w:noVBand="1" w:val="04A0"/>
       </w:tblPr>
       <w:tblGrid>
-        <w:gridCol w:w="9648"/>
+        <w:gridCol w:w="9792"/>
       </w:tblGrid>
       <w:tr>
         <w:tc>
@@ -1703,7 +1703,7 @@
         <w:tblLook w:firstColumn="1" w:firstRow="1" w:lastColumn="0" w:lastRow="0" w:noHBand="0" w:noVBand="1" w:val="04A0"/>
       </w:tblPr>
       <w:tblGrid>
-        <w:gridCol w:w="9648"/>
+        <w:gridCol w:w="9792"/>
       </w:tblGrid>
       <w:tr>
         <w:tc>
@@ -1816,7 +1816,7 @@
         <w:tblLook w:firstColumn="1" w:firstRow="1" w:lastColumn="0" w:lastRow="0" w:noHBand="0" w:noVBand="1" w:val="04A0"/>
       </w:tblPr>
       <w:tblGrid>
-        <w:gridCol w:w="9648"/>
+        <w:gridCol w:w="9792"/>
       </w:tblGrid>
       <w:tr>
         <w:tc>
@@ -1907,7 +1907,7 @@
         <w:tblLook w:firstColumn="1" w:firstRow="1" w:lastColumn="0" w:lastRow="0" w:noHBand="0" w:noVBand="1" w:val="04A0"/>
       </w:tblPr>
       <w:tblGrid>
-        <w:gridCol w:w="9648"/>
+        <w:gridCol w:w="9792"/>
       </w:tblGrid>
       <w:tr>
         <w:tc>
@@ -2006,7 +2006,7 @@
         <w:tblLook w:firstColumn="1" w:firstRow="1" w:lastColumn="0" w:lastRow="0" w:noHBand="0" w:noVBand="1" w:val="04A0"/>
       </w:tblPr>
       <w:tblGrid>
-        <w:gridCol w:w="9648"/>
+        <w:gridCol w:w="9792"/>
       </w:tblGrid>
       <w:tr>
         <w:tc>
@@ -2077,7 +2077,7 @@
           <w:color w:val="B91C1C"/>
           <w:sz w:val="23"/>
         </w:rPr>
-        <w:t>Câu 9: Prometheus hoạt động theo mô hình Pull hay Push? Cơ chế thu thập dữ liệu diễn ra như thế nào?</w:t>
+        <w:t>Câu 9: Prometheus là gì? Tác dụng, khái niệm và cơ chế hoạt động của Prometheus trong hệ thống?</w:t>
       </w:r>
     </w:p>
     <w:p>
@@ -2099,7 +2099,34 @@
           <w:color w:val="1E293B"/>
           <w:sz w:val="21"/>
         </w:rPr>
-        <w:t>Prometheus hoạt động theo mô hình PULL (kéo dữ liệu). Cứ sau mỗi chu kỳ định kỳ (scrape_interval = 10 giây), máy chủ Prometheus sẽ chủ động gửi yêu cầu HTTP GET tới endpoint /metrics của các dịch vụ và Exporter mục tiêu. Dữ liệu nhận về ở định dạng văn bản chuẩn Prometheus (gồm tên metric, nhãn và giá trị), sau đó được lưu vào cơ sở dữ liệu chuỗi thời gian (TSDB) nội bộ của Prometheus.</w:t>
+        <w:t>Dạ thưa Thầy/Cô, về Prometheus:</w:t>
+        <w:br/>
+        <w:br/>
+        <w:t>1. KHÁI NIỆM:</w:t>
+        <w:br/>
+        <w:t>Prometheus là một hệ thống giám sát (Monitoring System) và cảnh báo mã nguồn mở, ban đầu được phát triển bởi SoundCloud và hiện là dự án tốt nghiệp thứ hai (sau Kubernetes) của tổ chức Cloud Native Computing Foundation (CNCF). Prometheus được thiết kế chuyên biệt để theo dõi độ tin cậy và hiệu năng của các hệ thống vi dịch vụ (Microservices) và Docker Containers.</w:t>
+        <w:br/>
+        <w:br/>
+        <w:t>2. TÁC DỤNG TRONG HỆ THỐNG:</w:t>
+        <w:br/>
+        <w:t>- Thu thập số liệu hiệu năng (Metrics) theo thời gian thực từ phần cứng, hệ điều hành đến ứng dụng.</w:t>
+        <w:br/>
+        <w:t>- Lưu trữ dữ liệu dạng chuỗi thời gian (Time-Series Database - TSDB) với tốc độ nén và truy xuất cực cao.</w:t>
+        <w:br/>
+        <w:t>- Cung cấp ngôn ngữ truy vấn mạnh mẽ PromQL (Prometheus Query Language) để tính toán tỉ lệ tải (rate), giá trị trung bình, phần trăm (percentile), cộng dồn (sum).</w:t>
+        <w:br/>
+        <w:t>- Hỗ trợ phát hiện lỗi và gửi cảnh báo (Alerting) khi hệ thống gặp sự cố (quá tải CPU, hết RAM, service bị sập).</w:t>
+        <w:br/>
+        <w:br/>
+        <w:t>3. CƠ CHẾ HOẠT ĐỘNG:</w:t>
+        <w:br/>
+        <w:t>- Khám phá mục tiêu (Target Discovery): Prometheus đọc file cấu hình prometheus.yml để xác định danh sách các điểm cuối cần giám sát (Targets: web:3001, node_exporter:9100, cadvisor:8080, mysql_exporter:9104).</w:t>
+        <w:br/>
+        <w:t>- Kéo dữ liệu định kỳ (PULL Mechanism): Cứ sau mỗi chu kỳ scrape_interval (10 giây), Prometheus chủ động gửi yêu cầu HTTP GET tới endpoint /metrics của từng Target để lấy dữ liệu.</w:t>
+        <w:br/>
+        <w:t>- Xử lý &amp; Lưu trữ: Dữ liệu nhận về được gắn nhãn (Labels: job, instance) và lưu trữ trực tiếp vào cơ sở dữ liệu chuỗi thời gian TSDB trên ổ cứng bền vững (Volume prom_data).</w:t>
+        <w:br/>
+        <w:t>- Cung cấp API cho Grafana: Prometheus mở cổng 9090 để Grafana truy vấn dữ liệu bằng PromQL và vẽ biểu đồ trực quan.</w:t>
       </w:r>
     </w:p>
     <w:tbl>
@@ -2109,7 +2136,7 @@
         <w:tblLook w:firstColumn="1" w:firstRow="1" w:lastColumn="0" w:lastRow="0" w:noHBand="0" w:noVBand="1" w:val="04A0"/>
       </w:tblPr>
       <w:tblGrid>
-        <w:gridCol w:w="9648"/>
+        <w:gridCol w:w="9792"/>
       </w:tblGrid>
       <w:tr>
         <w:tc>
@@ -2143,7 +2170,7 @@
                 <w:color w:val="1E3A8A"/>
                 <w:sz w:val="19"/>
               </w:rPr>
-              <w:t>Ngược lại với mô hình PUSH (như Zabbix hay Datadog agent), mô hình PULL giúp Prometheus kiểm soát được tải thu thập và dễ dàng phát hiện khi một mục tiêu bị chết (DOWN).</w:t>
+              <w:t>Nhớ từ khóa: 'CNCF Project', 'Time-Series Database (TSDB)', 'PULL mechanism qua HTTP /metrics', 'Ngôn ngữ PromQL'.</w:t>
             </w:r>
           </w:p>
         </w:tc>
@@ -2166,7 +2193,218 @@
           <w:color w:val="B91C1C"/>
           <w:sz w:val="23"/>
         </w:rPr>
-        <w:t>Câu 10: Hệ thống của em đang giám sát những tầng nào và sử dụng những Exporter nào?</w:t>
+        <w:t>Câu 10: Grafana là gì? Tác dụng, khái niệm và cơ chế hoạt động của Grafana trong hệ thống?</w:t>
+      </w:r>
+    </w:p>
+    <w:p>
+      <w:pPr>
+        <w:spacing w:before="40" w:after="80"/>
+      </w:pPr>
+      <w:r>
+        <w:rPr>
+          <w:rFonts w:ascii="Times New Roman" w:hAnsi="Times New Roman"/>
+          <w:b/>
+          <w:color w:val="10B981"/>
+          <w:sz w:val="22"/>
+        </w:rPr>
+        <w:t xml:space="preserve">👉 Trả lời: </w:t>
+      </w:r>
+      <w:r>
+        <w:rPr>
+          <w:rFonts w:ascii="Times New Roman" w:hAnsi="Times New Roman"/>
+          <w:color w:val="1E293B"/>
+          <w:sz w:val="21"/>
+        </w:rPr>
+        <w:t>Dạ thưa Thầy/Cô, về Grafana:</w:t>
+        <w:br/>
+        <w:br/>
+        <w:t>1. KHÁI NIỆM:</w:t>
+        <w:br/>
+        <w:t>Grafana là nền tảng mã nguồn mở hàng đầu thế giới về Trực quan hóa dữ liệu (Data Visualization), Phân tích số liệu và Giám sát giao diện người dùng, được phát triển bởi Grafana Labs. Grafana biến các chuỗi số liệu thô phức tạp thành các bảng điều khiển (Dashboards) trực quan, sinh động và dễ hiểu đối với con người.</w:t>
+        <w:br/>
+        <w:br/>
+        <w:t>2. TÁC DỤNG TRONG HỆ THỐNG:</w:t>
+        <w:br/>
+        <w:t>- Trực quan hóa đa dạng: Cung cấp hàng chục loại biểu đồ: Time Series (biểu đồ đường theo thời gian), Gauge (đồng hồ đo tốc độ/phần trăm), Stat (thẻ hiển thị số liệu lớn), Bar Chart, Heatmap, Bảng dữ liệu.</w:t>
+        <w:br/>
+        <w:t>- Hợp nhất một màn hình duy nhất (Single Pane of Glass): Cho phép người quản trị vừa theo dõi chỉ số hiệu năng (Metrics từ Prometheus) vừa theo dõi nhật ký hoạt động (Logs từ Loki) trên cùng một giao diện duy nhất.</w:t>
+        <w:br/>
+        <w:t>- Đa nguồn dữ liệu (Multi-DataSource): Grafana không tự lưu trữ dữ liệu mà kết nối linh hoạt tới nhiều Data Sources: Prometheus, Loki, MySQL, InfluxDB, Elasticsearch, CloudWatch...</w:t>
+        <w:br/>
+        <w:t>- Tùy biến và Tương tác cao: Hỗ trợ lọc khoảng thời gian (now-5m, now-1h, now-24h), tự động làm mới (Auto-refresh 5s, 10s), phóng to thu nhỏ (Zoom-in/Zoom-out) các điểm bất thường trên đồ thị.</w:t>
+        <w:br/>
+        <w:br/>
+        <w:t>3. CƠ CHẾ HOẠT ĐỘNG:</w:t>
+        <w:br/>
+        <w:t>- Kết nối Data Source: Người quản trị cấu hình nguồn cấp dữ liệu trong Grafana (Data Source Prometheus qua URL http://prometheus:9090 và Loki qua http://loki:3100).</w:t>
+        <w:br/>
+        <w:t>- Gửi câu truy vấn: Khi người dùng mở Dashboard, mỗi Panel trong Grafana sẽ tự động gửi câu truy vấn tương ứng (PromQL tới Prometheus hoặc LogQL tới Loki) thông qua HTTP REST API nội bộ.</w:t>
+        <w:br/>
+        <w:t>- Nhận dữ liệu &amp; Render đồ họa: Máy chủ Prometheus/Loki xử lý tính toán và trả về kết quả JSON. Grafana tiếp nhận dữ liệu và vẽ biểu đồ dạng vector trên trình duyệt web của người dùng.</w:t>
+        <w:br/>
+        <w:t>- Cập nhật chu kỳ: Nếu bật tính năng Auto-refresh, Grafana sẽ lặp lại quá trình truy vấn trên theo chu kỳ để biểu đồ dịch chuyển và nhảy số theo thời gian thực.</w:t>
+      </w:r>
+    </w:p>
+    <w:tbl>
+      <w:tblPr>
+        <w:tblW w:type="auto" w:w="0"/>
+        <w:jc w:val="center"/>
+        <w:tblLook w:firstColumn="1" w:firstRow="1" w:lastColumn="0" w:lastRow="0" w:noHBand="0" w:noVBand="1" w:val="04A0"/>
+      </w:tblPr>
+      <w:tblGrid>
+        <w:gridCol w:w="9792"/>
+      </w:tblGrid>
+      <w:tr>
+        <w:tc>
+          <w:tcPr>
+            <w:tcW w:type="dxa" w:w="9648"/>
+            <w:shd w:fill="EFF6FF"/>
+            <w:tcMar>
+              <w:top w:w="80" w:type="dxa"/>
+              <w:bottom w:w="80" w:type="dxa"/>
+              <w:left w:w="120" w:type="dxa"/>
+              <w:right w:w="120" w:type="dxa"/>
+            </w:tcMar>
+          </w:tcPr>
+          <w:p>
+            <w:pPr>
+              <w:spacing w:after="0"/>
+            </w:pPr>
+            <w:r>
+              <w:rPr>
+                <w:rFonts w:ascii="Times New Roman" w:hAnsi="Times New Roman"/>
+                <w:b/>
+                <w:color w:val="1D4ED8"/>
+                <w:sz w:val="20"/>
+              </w:rPr>
+              <w:t xml:space="preserve">💡 Điểm nhấn ăn trọn điểm: </w:t>
+            </w:r>
+            <w:r>
+              <w:rPr>
+                <w:rFonts w:ascii="Times New Roman" w:hAnsi="Times New Roman"/>
+                <w:i/>
+                <w:color w:val="1E3A8A"/>
+                <w:sz w:val="19"/>
+              </w:rPr>
+              <w:t>Nhớ từ khóa: 'Visualization Layer', 'Single Pane of Glass (hợp nhất Metrics và Logs)', 'Data Source agnostic (không tự lưu dữ liệu mà truy vấn từ nguồn)'.</w:t>
+            </w:r>
+          </w:p>
+        </w:tc>
+      </w:tr>
+    </w:tbl>
+    <w:p>
+      <w:pPr>
+        <w:spacing w:after="80"/>
+      </w:pPr>
+    </w:p>
+    <w:p>
+      <w:pPr>
+        <w:keepNext/>
+        <w:spacing w:before="200" w:after="60"/>
+      </w:pPr>
+      <w:r>
+        <w:rPr>
+          <w:rFonts w:ascii="Times New Roman" w:hAnsi="Times New Roman"/>
+          <w:b/>
+          <w:color w:val="B91C1C"/>
+          <w:sz w:val="23"/>
+        </w:rPr>
+        <w:t>Câu 11: Prometheus hoạt động theo mô hình Pull hay Push? So sánh ưu điểm của mô hình Pull?</w:t>
+      </w:r>
+    </w:p>
+    <w:p>
+      <w:pPr>
+        <w:spacing w:before="40" w:after="80"/>
+      </w:pPr>
+      <w:r>
+        <w:rPr>
+          <w:rFonts w:ascii="Times New Roman" w:hAnsi="Times New Roman"/>
+          <w:b/>
+          <w:color w:val="10B981"/>
+          <w:sz w:val="22"/>
+        </w:rPr>
+        <w:t xml:space="preserve">👉 Trả lời: </w:t>
+      </w:r>
+      <w:r>
+        <w:rPr>
+          <w:rFonts w:ascii="Times New Roman" w:hAnsi="Times New Roman"/>
+          <w:color w:val="1E293B"/>
+          <w:sz w:val="21"/>
+        </w:rPr>
+        <w:t>Prometheus hoạt động theo mô hình PULL (máy chủ chủ động kéo dữ liệu). Ưu điểm vượt trội của mô hình PULL so với PUSH:</w:t>
+        <w:br/>
+        <w:t>1. Kiểm soát tải của Server: Prometheus tự quyết định thời điểm và tần suất cào dữ liệu (scrape_interval), không bao giờ bị nghẽn mạng do hàng nghìn client đồng loạt 'bắn' dữ liệu về máy chủ.</w:t>
+        <w:br/>
+        <w:t>2. Dễ dàng phát hiện sự cố: Khi một ứng dụng hoặc Exporter bị sập (DOWN), Prometheus gửi request cào dữ liệu không thành công sẽ lập tức phát hiện và đánh dấu mục tiêu đó là DOWN ngay trên bảng điều khiển.</w:t>
+        <w:br/>
+        <w:t>3. Kiến trúc đơn giản: Phía ứng dụng chỉ cần mở một cổng HTTP GET /metrics đơn giản, không cần cấu hình địa chỉ IP máy chủ giám sát phức tạp.</w:t>
+      </w:r>
+    </w:p>
+    <w:tbl>
+      <w:tblPr>
+        <w:tblW w:type="auto" w:w="0"/>
+        <w:jc w:val="center"/>
+        <w:tblLook w:firstColumn="1" w:firstRow="1" w:lastColumn="0" w:lastRow="0" w:noHBand="0" w:noVBand="1" w:val="04A0"/>
+      </w:tblPr>
+      <w:tblGrid>
+        <w:gridCol w:w="9792"/>
+      </w:tblGrid>
+      <w:tr>
+        <w:tc>
+          <w:tcPr>
+            <w:tcW w:type="dxa" w:w="9648"/>
+            <w:shd w:fill="EFF6FF"/>
+            <w:tcMar>
+              <w:top w:w="80" w:type="dxa"/>
+              <w:bottom w:w="80" w:type="dxa"/>
+              <w:left w:w="120" w:type="dxa"/>
+              <w:right w:w="120" w:type="dxa"/>
+            </w:tcMar>
+          </w:tcPr>
+          <w:p>
+            <w:pPr>
+              <w:spacing w:after="0"/>
+            </w:pPr>
+            <w:r>
+              <w:rPr>
+                <w:rFonts w:ascii="Times New Roman" w:hAnsi="Times New Roman"/>
+                <w:b/>
+                <w:color w:val="1D4ED8"/>
+                <w:sz w:val="20"/>
+              </w:rPr>
+              <w:t xml:space="preserve">💡 Điểm nhấn ăn trọn điểm: </w:t>
+            </w:r>
+            <w:r>
+              <w:rPr>
+                <w:rFonts w:ascii="Times New Roman" w:hAnsi="Times New Roman"/>
+                <w:i/>
+                <w:color w:val="1E3A8A"/>
+                <w:sz w:val="19"/>
+              </w:rPr>
+              <w:t>Nếu thầy cô hỏi 'Có trường hợp nào Prometheus dùng Push không?' -&gt; Trả lời: Có, khi giám sát các tiến trình ngắn hạn (Batch jobs, Cron jobs), Prometheus sẽ dùng một thành phần phụ trợ gọi là Pushgateway.</w:t>
+            </w:r>
+          </w:p>
+        </w:tc>
+      </w:tr>
+    </w:tbl>
+    <w:p>
+      <w:pPr>
+        <w:spacing w:after="80"/>
+      </w:pPr>
+    </w:p>
+    <w:p>
+      <w:pPr>
+        <w:keepNext/>
+        <w:spacing w:before="200" w:after="60"/>
+      </w:pPr>
+      <w:r>
+        <w:rPr>
+          <w:rFonts w:ascii="Times New Roman" w:hAnsi="Times New Roman"/>
+          <w:b/>
+          <w:color w:val="B91C1C"/>
+          <w:sz w:val="23"/>
+        </w:rPr>
+        <w:t>Câu 12: Hệ thống của em đang giám sát những tầng nào và sử dụng những Exporter nào?</w:t>
       </w:r>
     </w:p>
     <w:p>
@@ -2206,7 +2444,7 @@
         <w:tblLook w:firstColumn="1" w:firstRow="1" w:lastColumn="0" w:lastRow="0" w:noHBand="0" w:noVBand="1" w:val="04A0"/>
       </w:tblPr>
       <w:tblGrid>
-        <w:gridCol w:w="9648"/>
+        <w:gridCol w:w="9792"/>
       </w:tblGrid>
       <w:tr>
         <w:tc>
@@ -2263,7 +2501,7 @@
           <w:color w:val="B91C1C"/>
           <w:sz w:val="23"/>
         </w:rPr>
-        <w:t>Câu 11: Em đã tự định nghĩa những Custom Metric (chỉ số nghiệp vụ) nào trong mã nguồn Node.js?</w:t>
+        <w:t>Câu 13: Em đã tự định nghĩa những Custom Metric (chỉ số nghiệp vụ) nào trong mã nguồn Node.js?</w:t>
       </w:r>
     </w:p>
     <w:p>
@@ -2303,7 +2541,7 @@
         <w:tblLook w:firstColumn="1" w:firstRow="1" w:lastColumn="0" w:lastRow="0" w:noHBand="0" w:noVBand="1" w:val="04A0"/>
       </w:tblPr>
       <w:tblGrid>
-        <w:gridCol w:w="9648"/>
+        <w:gridCol w:w="9792"/>
       </w:tblGrid>
       <w:tr>
         <w:tc>
@@ -2360,7 +2598,7 @@
           <w:color w:val="B91C1C"/>
           <w:sz w:val="23"/>
         </w:rPr>
-        <w:t>Câu 12: Sự khác biệt giữa Counter và Gauge trong Prometheus là gì?</w:t>
+        <w:t>Câu 14: Sự khác biệt giữa Counter và Gauge trong Prometheus là gì?</w:t>
       </w:r>
     </w:p>
     <w:p>
@@ -2396,7 +2634,7 @@
         <w:tblLook w:firstColumn="1" w:firstRow="1" w:lastColumn="0" w:lastRow="0" w:noHBand="0" w:noVBand="1" w:val="04A0"/>
       </w:tblPr>
       <w:tblGrid>
-        <w:gridCol w:w="9648"/>
+        <w:gridCol w:w="9792"/>
       </w:tblGrid>
       <w:tr>
         <w:tc>
@@ -2467,7 +2705,7 @@
           <w:color w:val="B91C1C"/>
           <w:sz w:val="23"/>
         </w:rPr>
-        <w:t>Câu 13: Tại sao em chọn Loki thay vì giải pháp ELK (Elasticsearch, Logstash, Kibana)?</w:t>
+        <w:t>Câu 15: Tại sao em chọn Loki thay vì giải pháp ELK (Elasticsearch, Logstash, Kibana)?</w:t>
       </w:r>
     </w:p>
     <w:p>
@@ -2505,7 +2743,7 @@
         <w:tblLook w:firstColumn="1" w:firstRow="1" w:lastColumn="0" w:lastRow="0" w:noHBand="0" w:noVBand="1" w:val="04A0"/>
       </w:tblPr>
       <w:tblGrid>
-        <w:gridCol w:w="9648"/>
+        <w:gridCol w:w="9792"/>
       </w:tblGrid>
       <w:tr>
         <w:tc>
@@ -2562,7 +2800,7 @@
           <w:color w:val="B91C1C"/>
           <w:sz w:val="23"/>
         </w:rPr>
-        <w:t>Câu 14: Promtail thu thập log từ Docker như thế nào?</w:t>
+        <w:t>Câu 16: Promtail thu thập log từ Docker như thế nào?</w:t>
       </w:r>
     </w:p>
     <w:p>
@@ -2594,7 +2832,7 @@
         <w:tblLook w:firstColumn="1" w:firstRow="1" w:lastColumn="0" w:lastRow="0" w:noHBand="0" w:noVBand="1" w:val="04A0"/>
       </w:tblPr>
       <w:tblGrid>
-        <w:gridCol w:w="9648"/>
+        <w:gridCol w:w="9792"/>
       </w:tblGrid>
       <w:tr>
         <w:tc>
@@ -2651,7 +2889,7 @@
           <w:color w:val="B91C1C"/>
           <w:sz w:val="23"/>
         </w:rPr>
-        <w:t>Câu 15: Em hãy viết và giải thích 3 câu truy vấn LogQL để kiểm tra log hệ thống?</w:t>
+        <w:t>Câu 17: Em hãy viết và giải thích 3 câu truy vấn LogQL để kiểm tra log hệ thống?</w:t>
       </w:r>
     </w:p>
     <w:p>
@@ -2689,7 +2927,7 @@
         <w:tblLook w:firstColumn="1" w:firstRow="1" w:lastColumn="0" w:lastRow="0" w:noHBand="0" w:noVBand="1" w:val="04A0"/>
       </w:tblPr>
       <w:tblGrid>
-        <w:gridCol w:w="9648"/>
+        <w:gridCol w:w="9792"/>
       </w:tblGrid>
       <w:tr>
         <w:tc>
@@ -2760,7 +2998,7 @@
           <w:color w:val="B91C1C"/>
           <w:sz w:val="23"/>
         </w:rPr>
-        <w:t>Câu 16: Hardening là gì? Em đã áp dụng những biện pháp Hardening cụ thể nào vào hệ thống này?</w:t>
+        <w:t>Câu 18: Hardening là gì? Em đã áp dụng những biện pháp Hardening cụ thể nào vào hệ thống này?</w:t>
       </w:r>
     </w:p>
     <w:p>
@@ -2800,7 +3038,7 @@
         <w:tblLook w:firstColumn="1" w:firstRow="1" w:lastColumn="0" w:lastRow="0" w:noHBand="0" w:noVBand="1" w:val="04A0"/>
       </w:tblPr>
       <w:tblGrid>
-        <w:gridCol w:w="9648"/>
+        <w:gridCol w:w="9792"/>
       </w:tblGrid>
       <w:tr>
         <w:tc>
@@ -2857,7 +3095,7 @@
           <w:color w:val="B91C1C"/>
           <w:sz w:val="23"/>
         </w:rPr>
-        <w:t>Câu 17: Tại sao em chia làm 2 mạng frontend_net và backend_net? Lợi ích bảo mật là gì?</w:t>
+        <w:t>Câu 19: Tại sao em chia làm 2 mạng frontend_net và backend_net? Lợi ích bảo mật là gì?</w:t>
       </w:r>
     </w:p>
     <w:p>
@@ -2895,7 +3133,7 @@
         <w:tblLook w:firstColumn="1" w:firstRow="1" w:lastColumn="0" w:lastRow="0" w:noHBand="0" w:noVBand="1" w:val="04A0"/>
       </w:tblPr>
       <w:tblGrid>
-        <w:gridCol w:w="9648"/>
+        <w:gridCol w:w="9792"/>
       </w:tblGrid>
       <w:tr>
         <w:tc>
@@ -2952,7 +3190,7 @@
           <w:color w:val="B91C1C"/>
           <w:sz w:val="23"/>
         </w:rPr>
-        <w:t>Câu 18: Tại sao em chọn thuật toán băm scrypt để lưu mật khẩu thay vì MD5 hay SHA-256 thông thường?</w:t>
+        <w:t>Câu 20: Tại sao em chọn thuật toán băm scrypt để lưu mật khẩu thay vì MD5 hay SHA-256 thông thường?</w:t>
       </w:r>
     </w:p>
     <w:p>
@@ -2986,7 +3224,7 @@
         <w:tblLook w:firstColumn="1" w:firstRow="1" w:lastColumn="0" w:lastRow="0" w:noHBand="0" w:noVBand="1" w:val="04A0"/>
       </w:tblPr>
       <w:tblGrid>
-        <w:gridCol w:w="9648"/>
+        <w:gridCol w:w="9792"/>
       </w:tblGrid>
       <w:tr>
         <w:tc>
@@ -3043,7 +3281,7 @@
           <w:color w:val="B91C1C"/>
           <w:sz w:val="23"/>
         </w:rPr>
-        <w:t>Câu 19: Tại sao phải ký số HMAC-SHA256 cho Cookie phiên làm việc (Session Cookie)?</w:t>
+        <w:t>Câu 21: Tại sao phải ký số HMAC-SHA256 cho Cookie phiên làm việc (Session Cookie)?</w:t>
       </w:r>
     </w:p>
     <w:p>
@@ -3077,7 +3315,7 @@
         <w:tblLook w:firstColumn="1" w:firstRow="1" w:lastColumn="0" w:lastRow="0" w:noHBand="0" w:noVBand="1" w:val="04A0"/>
       </w:tblPr>
       <w:tblGrid>
-        <w:gridCol w:w="9648"/>
+        <w:gridCol w:w="9792"/>
       </w:tblGrid>
       <w:tr>
         <w:tc>
@@ -3148,7 +3386,7 @@
           <w:color w:val="B91C1C"/>
           <w:sz w:val="23"/>
         </w:rPr>
-        <w:t>Câu 20: Nếu trang web bất ngờ bị chậm hoặc sập, em sẽ dùng các công cụ đã cài đặt để điều tra và xử lý theo các bước nào?</w:t>
+        <w:t>Câu 22: Nếu trang web bất ngờ bị chậm hoặc sập, em sẽ dùng các công cụ đã cài đặt để điều tra và xử lý theo các bước nào?</w:t>
       </w:r>
     </w:p>
     <w:p>
@@ -3186,7 +3424,7 @@
         <w:tblLook w:firstColumn="1" w:firstRow="1" w:lastColumn="0" w:lastRow="0" w:noHBand="0" w:noVBand="1" w:val="04A0"/>
       </w:tblPr>
       <w:tblGrid>
-        <w:gridCol w:w="9648"/>
+        <w:gridCol w:w="9792"/>
       </w:tblGrid>
       <w:tr>
         <w:tc>
@@ -3243,7 +3481,7 @@
           <w:color w:val="B91C1C"/>
           <w:sz w:val="23"/>
         </w:rPr>
-        <w:t>Câu 21: Dữ liệu của MySQL, Prometheus, Grafana có bị mất khi khởi động lại máy ảo hoặc tắt container không? Tại sao?</w:t>
+        <w:t>Câu 23: Dữ liệu của MySQL, Prometheus, Grafana có bị mất khi khởi động lại máy ảo hoặc tắt container không? Tại sao?</w:t>
       </w:r>
     </w:p>
     <w:p>
@@ -3285,7 +3523,7 @@
         <w:tblLook w:firstColumn="1" w:firstRow="1" w:lastColumn="0" w:lastRow="0" w:noHBand="0" w:noVBand="1" w:val="04A0"/>
       </w:tblPr>
       <w:tblGrid>
-        <w:gridCol w:w="9648"/>
+        <w:gridCol w:w="9792"/>
       </w:tblGrid>
       <w:tr>
         <w:tc>
@@ -3342,7 +3580,7 @@
           <w:color w:val="B91C1C"/>
           <w:sz w:val="23"/>
         </w:rPr>
-        <w:t>Câu 22: Khi cập nhật mã nguồn mới từ Git trên máy ảo Ubuntu, em thực hiện những lệnh nào?</w:t>
+        <w:t>Câu 24: Khi cập nhật mã nguồn mới từ Git trên máy ảo Ubuntu, em thực hiện những lệnh nào?</w:t>
       </w:r>
     </w:p>
     <w:p>
@@ -3380,7 +3618,7 @@
         <w:tblLook w:firstColumn="1" w:firstRow="1" w:lastColumn="0" w:lastRow="0" w:noHBand="0" w:noVBand="1" w:val="04A0"/>
       </w:tblPr>
       <w:tblGrid>
-        <w:gridCol w:w="9648"/>
+        <w:gridCol w:w="9792"/>
       </w:tblGrid>
       <w:tr>
         <w:tc>
@@ -3437,7 +3675,7 @@
           <w:color w:val="B91C1C"/>
           <w:sz w:val="23"/>
         </w:rPr>
-        <w:t>Câu 23: Làm thế nào để sao lưu (Backup) cơ sở dữ liệu MySQL định kỳ trong môi trường Docker?</w:t>
+        <w:t>Câu 25: Làm thế nào để sao lưu (Backup) cơ sở dữ liệu MySQL định kỳ trong môi trường Docker?</w:t>
       </w:r>
     </w:p>
     <w:p>
@@ -3473,7 +3711,7 @@
         <w:tblLook w:firstColumn="1" w:firstRow="1" w:lastColumn="0" w:lastRow="0" w:noHBand="0" w:noVBand="1" w:val="04A0"/>
       </w:tblPr>
       <w:tblGrid>
-        <w:gridCol w:w="9648"/>
+        <w:gridCol w:w="9792"/>
       </w:tblGrid>
       <w:tr>
         <w:tc>
@@ -3530,7 +3768,7 @@
           <w:color w:val="B91C1C"/>
           <w:sz w:val="23"/>
         </w:rPr>
-        <w:t>Câu 24: Tại sao khi truy cập trang web bằng IP máy ảo, các ảnh poster phim HD vẫn tải về bình thường mà không bị lỗi?</w:t>
+        <w:t>Câu 26: Tại sao khi truy cập trang web bằng IP máy ảo, các ảnh poster phim HD vẫn tải về bình thường mà không bị lỗi?</w:t>
       </w:r>
     </w:p>
     <w:p>
@@ -3562,7 +3800,7 @@
         <w:tblLook w:firstColumn="1" w:firstRow="1" w:lastColumn="0" w:lastRow="0" w:noHBand="0" w:noVBand="1" w:val="04A0"/>
       </w:tblPr>
       <w:tblGrid>
-        <w:gridCol w:w="9648"/>
+        <w:gridCol w:w="9792"/>
       </w:tblGrid>
       <w:tr>
         <w:tc>
@@ -3619,7 +3857,7 @@
           <w:color w:val="B91C1C"/>
           <w:sz w:val="23"/>
         </w:rPr>
-        <w:t>Câu 25: Theo em, nếu hệ thống này được triển khai lên Production thực tế cho hàng triệu người dùng, em sẽ nâng cấp thêm những gì?</w:t>
+        <w:t>Câu 27: Theo em, nếu hệ thống này được triển khai lên Production thực tế cho hàng triệu người dùng, em sẽ nâng cấp thêm những gì?</w:t>
       </w:r>
     </w:p>
     <w:p>
@@ -3659,7 +3897,7 @@
         <w:tblLook w:firstColumn="1" w:firstRow="1" w:lastColumn="0" w:lastRow="0" w:noHBand="0" w:noVBand="1" w:val="04A0"/>
       </w:tblPr>
       <w:tblGrid>
-        <w:gridCol w:w="9648"/>
+        <w:gridCol w:w="9792"/>
       </w:tblGrid>
       <w:tr>
         <w:tc>
@@ -3706,7 +3944,7 @@
     </w:p>
     <w:sectPr>
       <w:pgSz w:w="12240" w:h="15840"/>
-      <w:pgMar w:top="1152" w:right="1296" w:bottom="1152" w:left="1296" w:header="720" w:footer="720" w:gutter="0"/>
+      <w:pgMar w:top="1152" w:right="1224" w:bottom="1152" w:left="1224" w:header="720" w:footer="720" w:gutter="0"/>
       <w:cols w:space="720"/>
       <w:docGrid w:linePitch="360"/>
     </w:sectPr>

</xml_diff>